<commit_message>
Complete protocol unification and code fixes
</commit_message>
<xml_diff>
--- a/HMR-BiLSTM_Installation_Guide.docx
+++ b/HMR-BiLSTM_Installation_Guide.docx
@@ -2057,6 +2057,35 @@
               <w:rPr>
                 <w:sz w:val="20"/>
               </w:rPr>
+              <w:t>python evaluate_autoattack.py</w:t>
+            </w:r>
+          </w:p>
+        </w:tc>
+        <w:tc>
+          <w:tcPr>
+            <w:tcW w:type="dxa" w:w="4819"/>
+            <w:shd w:val="clear" w:color="auto" w:fill="DCE6F1"/>
+          </w:tcPr>
+          <w:p>
+            <w:r>
+              <w:rPr>
+                <w:sz w:val="20"/>
+              </w:rPr>
+              <w:t>AutoAttack robustness evaluation (T7)</w:t>
+            </w:r>
+          </w:p>
+        </w:tc>
+      </w:tr>
+      <w:tr>
+        <w:tc>
+          <w:tcPr>
+            <w:tcW w:type="dxa" w:w="3969"/>
+          </w:tcPr>
+          <w:p>
+            <w:r>
+              <w:rPr>
+                <w:sz w:val="20"/>
+              </w:rPr>
               <w:t>python evaluate_robustness_all.py</w:t>
             </w:r>
           </w:p>
@@ -2064,7 +2093,6 @@
         <w:tc>
           <w:tcPr>
             <w:tcW w:type="dxa" w:w="4819"/>
-            <w:shd w:val="clear" w:color="auto" w:fill="DCE6F1"/>
           </w:tcPr>
           <w:p>
             <w:r>
@@ -2080,6 +2108,7 @@
         <w:tc>
           <w:tcPr>
             <w:tcW w:type="dxa" w:w="3969"/>
+            <w:shd w:val="clear" w:color="auto" w:fill="DCE6F1"/>
           </w:tcPr>
           <w:p>
             <w:r>
@@ -2093,6 +2122,7 @@
         <w:tc>
           <w:tcPr>
             <w:tcW w:type="dxa" w:w="4819"/>
+            <w:shd w:val="clear" w:color="auto" w:fill="DCE6F1"/>
           </w:tcPr>
           <w:p>
             <w:r>
@@ -2108,7 +2138,6 @@
         <w:tc>
           <w:tcPr>
             <w:tcW w:type="dxa" w:w="3969"/>
-            <w:shd w:val="clear" w:color="auto" w:fill="DCE6F1"/>
           </w:tcPr>
           <w:p>
             <w:r>
@@ -2122,7 +2151,6 @@
         <w:tc>
           <w:tcPr>
             <w:tcW w:type="dxa" w:w="4819"/>
-            <w:shd w:val="clear" w:color="auto" w:fill="DCE6F1"/>
           </w:tcPr>
           <w:p>
             <w:r>
@@ -2138,6 +2166,7 @@
         <w:tc>
           <w:tcPr>
             <w:tcW w:type="dxa" w:w="3969"/>
+            <w:shd w:val="clear" w:color="auto" w:fill="DCE6F1"/>
           </w:tcPr>
           <w:p>
             <w:r>
@@ -2151,6 +2180,7 @@
         <w:tc>
           <w:tcPr>
             <w:tcW w:type="dxa" w:w="4819"/>
+            <w:shd w:val="clear" w:color="auto" w:fill="DCE6F1"/>
           </w:tcPr>
           <w:p>
             <w:r>
@@ -2158,6 +2188,34 @@
                 <w:sz w:val="20"/>
               </w:rPr>
               <w:t>Export final figures and LaTeX/CSV tables</w:t>
+            </w:r>
+          </w:p>
+        </w:tc>
+      </w:tr>
+      <w:tr>
+        <w:tc>
+          <w:tcPr>
+            <w:tcW w:type="dxa" w:w="3969"/>
+          </w:tcPr>
+          <w:p>
+            <w:r>
+              <w:rPr>
+                <w:sz w:val="20"/>
+              </w:rPr>
+              <w:t>python evaluate_trustworthiness.py</w:t>
+            </w:r>
+          </w:p>
+        </w:tc>
+        <w:tc>
+          <w:tcPr>
+            <w:tcW w:type="dxa" w:w="4819"/>
+          </w:tcPr>
+          <w:p>
+            <w:r>
+              <w:rPr>
+                <w:sz w:val="20"/>
+              </w:rPr>
+              <w:t>Generate T8 Trustworthy Scorecard</w:t>
             </w:r>
           </w:p>
         </w:tc>
@@ -2231,6 +2289,79 @@
       </w:pPr>
       <w:r>
         <w:t>Tables:  results/tables/ (LaTeX .tex and .csv)</w:t>
+      </w:r>
+    </w:p>
+    <w:p/>
+    <w:p>
+      <w:pPr>
+        <w:pStyle w:val="Heading2"/>
+        <w:jc w:val="left"/>
+      </w:pPr>
+      <w:r>
+        <w:rPr>
+          <w:b/>
+          <w:color w:val="1F497D"/>
+          <w:sz w:val="24"/>
+        </w:rPr>
+        <w:t>Step 10: Run the Entire Pipeline Automatically (Alternative)</w:t>
+      </w:r>
+    </w:p>
+    <w:p>
+      <w:r>
+        <w:rPr>
+          <w:b w:val="0"/>
+          <w:i w:val="0"/>
+          <w:sz w:val="22"/>
+        </w:rPr>
+        <w:t>Instead of running each step manually, you can execute the entire experimental pipeline from start to finish using the orchestration scripts:</w:t>
+      </w:r>
+    </w:p>
+    <w:p>
+      <w:r>
+        <w:rPr>
+          <w:b/>
+          <w:i w:val="0"/>
+          <w:sz w:val="20"/>
+        </w:rPr>
+        <w:t>Windows:</w:t>
+      </w:r>
+    </w:p>
+    <w:p>
+      <w:pPr>
+        <w:spacing w:after="40"/>
+        <w:ind w:left="432"/>
+      </w:pPr>
+      <w:r>
+        <w:rPr>
+          <w:rFonts w:ascii="Courier New" w:hAnsi="Courier New"/>
+          <w:color w:val="006000"/>
+          <w:sz w:val="18"/>
+        </w:rPr>
+        <w:t>run_all.bat</w:t>
+      </w:r>
+    </w:p>
+    <w:p>
+      <w:r>
+        <w:rPr>
+          <w:b/>
+          <w:i w:val="0"/>
+          <w:sz w:val="20"/>
+        </w:rPr>
+        <w:t>Cross-platform (Python):</w:t>
+      </w:r>
+    </w:p>
+    <w:p>
+      <w:pPr>
+        <w:spacing w:after="40"/>
+        <w:ind w:left="432"/>
+      </w:pPr>
+      <w:r>
+        <w:rPr>
+          <w:rFonts w:ascii="Courier New" w:hAnsi="Courier New"/>
+          <w:color w:val="006000"/>
+          <w:sz w:val="18"/>
+        </w:rPr>
+        <w:t>python run_reproducible_pipeline.py</w:t>
       </w:r>
     </w:p>
     <w:p/>

</xml_diff>